<commit_message>
Final Student Management System
</commit_message>
<xml_diff>
--- a/Task Submission.docx
+++ b/Task Submission.docx
@@ -6,12 +6,16 @@
       <w:pPr>
         <w:jc w:val="center"/>
         <w:rPr>
-          <w:sz w:val="32"/>
-          <w:szCs w:val="32"/>
-        </w:rPr>
-      </w:pPr>
-      <w:r>
-        <w:rPr>
+          <w:b/>
+          <w:bCs/>
+          <w:sz w:val="32"/>
+          <w:szCs w:val="32"/>
+        </w:rPr>
+      </w:pPr>
+      <w:r>
+        <w:rPr>
+          <w:b/>
+          <w:bCs/>
           <w:sz w:val="32"/>
           <w:szCs w:val="32"/>
         </w:rPr>
@@ -72,12 +76,16 @@
       <w:pPr>
         <w:jc w:val="center"/>
         <w:rPr>
-          <w:sz w:val="32"/>
-          <w:szCs w:val="32"/>
-        </w:rPr>
-      </w:pPr>
-      <w:r>
-        <w:rPr>
+          <w:b/>
+          <w:bCs/>
+          <w:sz w:val="32"/>
+          <w:szCs w:val="32"/>
+        </w:rPr>
+      </w:pPr>
+      <w:r>
+        <w:rPr>
+          <w:b/>
+          <w:bCs/>
           <w:sz w:val="32"/>
           <w:szCs w:val="32"/>
         </w:rPr>
@@ -113,12 +121,16 @@
       <w:pPr>
         <w:jc w:val="center"/>
         <w:rPr>
-          <w:sz w:val="32"/>
-          <w:szCs w:val="32"/>
-        </w:rPr>
-      </w:pPr>
-      <w:r>
-        <w:rPr>
+          <w:b/>
+          <w:bCs/>
+          <w:sz w:val="32"/>
+          <w:szCs w:val="32"/>
+        </w:rPr>
+      </w:pPr>
+      <w:r>
+        <w:rPr>
+          <w:b/>
+          <w:bCs/>
           <w:sz w:val="32"/>
           <w:szCs w:val="32"/>
         </w:rPr>
@@ -127,6 +139,8 @@
       <w:proofErr w:type="spellStart"/>
       <w:r>
         <w:rPr>
+          <w:b/>
+          <w:bCs/>
           <w:sz w:val="32"/>
           <w:szCs w:val="32"/>
         </w:rPr>
@@ -344,18 +358,12 @@
     <w:p>
       <w:pPr>
         <w:rPr>
-          <w:sz w:val="24"/>
-          <w:szCs w:val="24"/>
-        </w:rPr>
-      </w:pPr>
-    </w:p>
-    <w:p>
-      <w:pPr>
-        <w:rPr>
-          <w:b/>
-          <w:bCs/>
-          <w:sz w:val="24"/>
-          <w:szCs w:val="24"/>
+          <w:rFonts w:ascii="Courier New" w:eastAsia="Times New Roman" w:hAnsi="Courier New" w:cs="Courier New"/>
+          <w:kern w:val="0"/>
+          <w:sz w:val="20"/>
+          <w:szCs w:val="20"/>
+          <w:lang w:eastAsia="en-IN" w:bidi="hi-IN"/>
+          <w14:ligatures w14:val="none"/>
         </w:rPr>
       </w:pPr>
       <w:r>
@@ -367,6 +375,41 @@
         </w:rPr>
         <w:t>GitHub Repository:</w:t>
       </w:r>
+      <w:r>
+        <w:rPr>
+          <w:rFonts w:ascii="Courier New" w:eastAsia="Times New Roman" w:hAnsi="Courier New" w:cs="Courier New"/>
+          <w:kern w:val="0"/>
+          <w:sz w:val="20"/>
+          <w:szCs w:val="20"/>
+          <w:lang w:eastAsia="en-IN" w:bidi="hi-IN"/>
+          <w14:ligatures w14:val="none"/>
+        </w:rPr>
+        <w:t xml:space="preserve"> </w:t>
+      </w:r>
+      <w:hyperlink r:id="rId4" w:history="1">
+        <w:r>
+          <w:rPr>
+            <w:rStyle w:val="Hyperlink"/>
+            <w:rFonts w:ascii="Courier New" w:eastAsia="Times New Roman" w:hAnsi="Courier New" w:cs="Courier New"/>
+            <w:kern w:val="0"/>
+            <w:sz w:val="20"/>
+            <w:szCs w:val="20"/>
+            <w:lang w:eastAsia="en-IN" w:bidi="hi-IN"/>
+            <w14:ligatures w14:val="none"/>
+          </w:rPr>
+          <w:t>https://github.com/yashtalaviya5/student-management-system.git</w:t>
+        </w:r>
+      </w:hyperlink>
+    </w:p>
+    <w:p>
+      <w:pPr>
+        <w:rPr>
+          <w:b/>
+          <w:bCs/>
+          <w:sz w:val="24"/>
+          <w:szCs w:val="24"/>
+        </w:rPr>
+      </w:pPr>
     </w:p>
     <w:p>
       <w:pPr>
@@ -428,7 +471,7 @@
                     </pic:cNvPicPr>
                   </pic:nvPicPr>
                   <pic:blipFill rotWithShape="1">
-                    <a:blip r:embed="rId4" cstate="print">
+                    <a:blip r:embed="rId5" cstate="print">
                       <a:extLst>
                         <a:ext uri="{28A0092B-C50C-407E-A947-70E740481C1C}">
                           <a14:useLocalDpi xmlns:a14="http://schemas.microsoft.com/office/drawing/2010/main" val="0"/>
@@ -525,7 +568,7 @@
                     </pic:cNvPicPr>
                   </pic:nvPicPr>
                   <pic:blipFill>
-                    <a:blip r:embed="rId5" cstate="print">
+                    <a:blip r:embed="rId6" cstate="print">
                       <a:extLst>
                         <a:ext uri="{28A0092B-C50C-407E-A947-70E740481C1C}">
                           <a14:useLocalDpi xmlns:a14="http://schemas.microsoft.com/office/drawing/2010/main" val="0"/>
@@ -612,97 +655,6 @@
                 <pic:pic xmlns:pic="http://schemas.openxmlformats.org/drawingml/2006/picture">
                   <pic:nvPicPr>
                     <pic:cNvPr id="0" name="Picture 5"/>
-                    <pic:cNvPicPr>
-                      <a:picLocks noChangeAspect="1" noChangeArrowheads="1"/>
-                    </pic:cNvPicPr>
-                  </pic:nvPicPr>
-                  <pic:blipFill>
-                    <a:blip r:embed="rId6" cstate="print">
-                      <a:extLst>
-                        <a:ext uri="{28A0092B-C50C-407E-A947-70E740481C1C}">
-                          <a14:useLocalDpi xmlns:a14="http://schemas.microsoft.com/office/drawing/2010/main" val="0"/>
-                        </a:ext>
-                      </a:extLst>
-                    </a:blip>
-                    <a:srcRect/>
-                    <a:stretch>
-                      <a:fillRect/>
-                    </a:stretch>
-                  </pic:blipFill>
-                  <pic:spPr bwMode="auto">
-                    <a:xfrm>
-                      <a:off x="0" y="0"/>
-                      <a:ext cx="5731510" cy="3402965"/>
-                    </a:xfrm>
-                    <a:prstGeom prst="rect">
-                      <a:avLst/>
-                    </a:prstGeom>
-                    <a:noFill/>
-                    <a:ln>
-                      <a:noFill/>
-                    </a:ln>
-                  </pic:spPr>
-                </pic:pic>
-              </a:graphicData>
-            </a:graphic>
-          </wp:inline>
-        </w:drawing>
-      </w:r>
-    </w:p>
-    <w:p>
-      <w:pPr>
-        <w:rPr>
-          <w:b/>
-          <w:bCs/>
-          <w:sz w:val="24"/>
-          <w:szCs w:val="24"/>
-        </w:rPr>
-      </w:pPr>
-      <w:r>
-        <w:rPr>
-          <w:b/>
-          <w:bCs/>
-          <w:sz w:val="24"/>
-          <w:szCs w:val="24"/>
-        </w:rPr>
-        <w:t>4 Add Student</w:t>
-      </w:r>
-      <w:r>
-        <w:rPr>
-          <w:b/>
-          <w:bCs/>
-          <w:sz w:val="24"/>
-          <w:szCs w:val="24"/>
-        </w:rPr>
-        <w:t>:</w:t>
-      </w:r>
-    </w:p>
-    <w:p>
-      <w:pPr>
-        <w:rPr>
-          <w:b/>
-          <w:bCs/>
-          <w:sz w:val="24"/>
-          <w:szCs w:val="24"/>
-        </w:rPr>
-      </w:pPr>
-      <w:r>
-        <w:rPr>
-          <w:noProof/>
-        </w:rPr>
-        <w:drawing>
-          <wp:inline distT="0" distB="0" distL="0" distR="0" wp14:anchorId="0D8C1F21" wp14:editId="41054F46">
-            <wp:extent cx="5731510" cy="3402965"/>
-            <wp:effectExtent l="0" t="0" r="2540" b="6985"/>
-            <wp:docPr id="229786900" name="Picture 4"/>
-            <wp:cNvGraphicFramePr>
-              <a:graphicFrameLocks xmlns:a="http://schemas.openxmlformats.org/drawingml/2006/main" noChangeAspect="1"/>
-            </wp:cNvGraphicFramePr>
-            <a:graphic xmlns:a="http://schemas.openxmlformats.org/drawingml/2006/main">
-              <a:graphicData uri="http://schemas.openxmlformats.org/drawingml/2006/picture">
-                <pic:pic xmlns:pic="http://schemas.openxmlformats.org/drawingml/2006/picture">
-                  <pic:nvPicPr>
-                    <pic:cNvPr id="0" name="Picture 7"/>
                     <pic:cNvPicPr>
                       <a:picLocks noChangeAspect="1" noChangeArrowheads="1"/>
                     </pic:cNvPicPr>
@@ -749,55 +701,14 @@
           <w:szCs w:val="24"/>
         </w:rPr>
       </w:pPr>
-    </w:p>
-    <w:p>
-      <w:pPr>
-        <w:rPr>
-          <w:b/>
-          <w:bCs/>
-          <w:sz w:val="24"/>
-          <w:szCs w:val="24"/>
-        </w:rPr>
-      </w:pPr>
-    </w:p>
-    <w:p>
-      <w:pPr>
-        <w:rPr>
-          <w:b/>
-          <w:bCs/>
-          <w:sz w:val="24"/>
-          <w:szCs w:val="24"/>
-        </w:rPr>
-      </w:pPr>
-    </w:p>
-    <w:p>
-      <w:pPr>
-        <w:rPr>
-          <w:b/>
-          <w:bCs/>
-          <w:sz w:val="24"/>
-          <w:szCs w:val="24"/>
-        </w:rPr>
-      </w:pPr>
-    </w:p>
-    <w:p>
-      <w:pPr>
-        <w:rPr>
-          <w:b/>
-          <w:bCs/>
-          <w:sz w:val="24"/>
-          <w:szCs w:val="24"/>
-        </w:rPr>
-      </w:pPr>
-      <w:r>
-        <w:rPr>
-          <w:b/>
-          <w:bCs/>
-          <w:sz w:val="24"/>
-          <w:szCs w:val="24"/>
-        </w:rPr>
-        <w:lastRenderedPageBreak/>
-        <w:t>5 Successfully Added</w:t>
+      <w:r>
+        <w:rPr>
+          <w:b/>
+          <w:bCs/>
+          <w:sz w:val="24"/>
+          <w:szCs w:val="24"/>
+        </w:rPr>
+        <w:t>4 Add Student</w:t>
       </w:r>
       <w:r>
         <w:rPr>
@@ -823,10 +734,10 @@
           <w:noProof/>
         </w:rPr>
         <w:drawing>
-          <wp:inline distT="0" distB="0" distL="0" distR="0" wp14:anchorId="0829DC21" wp14:editId="3036CA8D">
+          <wp:inline distT="0" distB="0" distL="0" distR="0" wp14:anchorId="0D8C1F21" wp14:editId="41054F46">
             <wp:extent cx="5731510" cy="3402965"/>
             <wp:effectExtent l="0" t="0" r="2540" b="6985"/>
-            <wp:docPr id="1231761927" name="Picture 5"/>
+            <wp:docPr id="229786900" name="Picture 4"/>
             <wp:cNvGraphicFramePr>
               <a:graphicFrameLocks xmlns:a="http://schemas.openxmlformats.org/drawingml/2006/main" noChangeAspect="1"/>
             </wp:cNvGraphicFramePr>
@@ -834,7 +745,7 @@
               <a:graphicData uri="http://schemas.openxmlformats.org/drawingml/2006/picture">
                 <pic:pic xmlns:pic="http://schemas.openxmlformats.org/drawingml/2006/picture">
                   <pic:nvPicPr>
-                    <pic:cNvPr id="0" name="Picture 9"/>
+                    <pic:cNvPr id="0" name="Picture 7"/>
                     <pic:cNvPicPr>
                       <a:picLocks noChangeAspect="1" noChangeArrowheads="1"/>
                     </pic:cNvPicPr>
@@ -891,34 +802,45 @@
           <w:szCs w:val="24"/>
         </w:rPr>
       </w:pPr>
-      <w:r>
-        <w:rPr>
-          <w:b/>
-          <w:bCs/>
-          <w:sz w:val="24"/>
-          <w:szCs w:val="24"/>
-        </w:rPr>
-        <w:t xml:space="preserve">6 </w:t>
-      </w:r>
-      <w:proofErr w:type="spellStart"/>
-      <w:r>
-        <w:rPr>
-          <w:b/>
-          <w:bCs/>
-          <w:sz w:val="24"/>
-          <w:szCs w:val="24"/>
-        </w:rPr>
-        <w:t>Addedd</w:t>
-      </w:r>
-      <w:proofErr w:type="spellEnd"/>
-      <w:r>
-        <w:rPr>
-          <w:b/>
-          <w:bCs/>
-          <w:sz w:val="24"/>
-          <w:szCs w:val="24"/>
-        </w:rPr>
-        <w:t xml:space="preserve"> Successfully</w:t>
+    </w:p>
+    <w:p>
+      <w:pPr>
+        <w:rPr>
+          <w:b/>
+          <w:bCs/>
+          <w:sz w:val="24"/>
+          <w:szCs w:val="24"/>
+        </w:rPr>
+      </w:pPr>
+    </w:p>
+    <w:p>
+      <w:pPr>
+        <w:rPr>
+          <w:b/>
+          <w:bCs/>
+          <w:sz w:val="24"/>
+          <w:szCs w:val="24"/>
+        </w:rPr>
+      </w:pPr>
+    </w:p>
+    <w:p>
+      <w:pPr>
+        <w:rPr>
+          <w:b/>
+          <w:bCs/>
+          <w:sz w:val="24"/>
+          <w:szCs w:val="24"/>
+        </w:rPr>
+      </w:pPr>
+      <w:r>
+        <w:rPr>
+          <w:b/>
+          <w:bCs/>
+          <w:sz w:val="24"/>
+          <w:szCs w:val="24"/>
+        </w:rPr>
+        <w:lastRenderedPageBreak/>
+        <w:t>5 Successfully Added</w:t>
       </w:r>
       <w:r>
         <w:rPr>
@@ -944,10 +866,10 @@
           <w:noProof/>
         </w:rPr>
         <w:drawing>
-          <wp:inline distT="0" distB="0" distL="0" distR="0" wp14:anchorId="454B5D16" wp14:editId="7449044C">
+          <wp:inline distT="0" distB="0" distL="0" distR="0" wp14:anchorId="0829DC21" wp14:editId="3036CA8D">
             <wp:extent cx="5731510" cy="3402965"/>
             <wp:effectExtent l="0" t="0" r="2540" b="6985"/>
-            <wp:docPr id="1051866414" name="Picture 6"/>
+            <wp:docPr id="1231761927" name="Picture 5"/>
             <wp:cNvGraphicFramePr>
               <a:graphicFrameLocks xmlns:a="http://schemas.openxmlformats.org/drawingml/2006/main" noChangeAspect="1"/>
             </wp:cNvGraphicFramePr>
@@ -955,7 +877,7 @@
               <a:graphicData uri="http://schemas.openxmlformats.org/drawingml/2006/picture">
                 <pic:pic xmlns:pic="http://schemas.openxmlformats.org/drawingml/2006/picture">
                   <pic:nvPicPr>
-                    <pic:cNvPr id="0" name="Picture 11"/>
+                    <pic:cNvPr id="0" name="Picture 9"/>
                     <pic:cNvPicPr>
                       <a:picLocks noChangeAspect="1" noChangeArrowheads="1"/>
                     </pic:cNvPicPr>
@@ -1012,35 +934,34 @@
           <w:szCs w:val="24"/>
         </w:rPr>
       </w:pPr>
-    </w:p>
-    <w:p>
-      <w:pPr>
-        <w:rPr>
-          <w:b/>
-          <w:bCs/>
-          <w:sz w:val="24"/>
-          <w:szCs w:val="24"/>
-        </w:rPr>
-      </w:pPr>
-    </w:p>
-    <w:p>
-      <w:pPr>
-        <w:rPr>
-          <w:b/>
-          <w:bCs/>
-          <w:sz w:val="24"/>
-          <w:szCs w:val="24"/>
-        </w:rPr>
-      </w:pPr>
-      <w:r>
-        <w:rPr>
-          <w:b/>
-          <w:bCs/>
-          <w:sz w:val="24"/>
-          <w:szCs w:val="24"/>
-        </w:rPr>
-        <w:lastRenderedPageBreak/>
-        <w:t>7 Update Student</w:t>
+      <w:r>
+        <w:rPr>
+          <w:b/>
+          <w:bCs/>
+          <w:sz w:val="24"/>
+          <w:szCs w:val="24"/>
+        </w:rPr>
+        <w:t xml:space="preserve">6 </w:t>
+      </w:r>
+      <w:proofErr w:type="spellStart"/>
+      <w:r>
+        <w:rPr>
+          <w:b/>
+          <w:bCs/>
+          <w:sz w:val="24"/>
+          <w:szCs w:val="24"/>
+        </w:rPr>
+        <w:t>Addedd</w:t>
+      </w:r>
+      <w:proofErr w:type="spellEnd"/>
+      <w:r>
+        <w:rPr>
+          <w:b/>
+          <w:bCs/>
+          <w:sz w:val="24"/>
+          <w:szCs w:val="24"/>
+        </w:rPr>
+        <w:t xml:space="preserve"> Successfully</w:t>
       </w:r>
       <w:r>
         <w:rPr>
@@ -1066,10 +987,10 @@
           <w:noProof/>
         </w:rPr>
         <w:drawing>
-          <wp:inline distT="0" distB="0" distL="0" distR="0" wp14:anchorId="730C7102" wp14:editId="13CE8174">
+          <wp:inline distT="0" distB="0" distL="0" distR="0" wp14:anchorId="454B5D16" wp14:editId="7449044C">
             <wp:extent cx="5731510" cy="3402965"/>
             <wp:effectExtent l="0" t="0" r="2540" b="6985"/>
-            <wp:docPr id="734355034" name="Picture 7"/>
+            <wp:docPr id="1051866414" name="Picture 6"/>
             <wp:cNvGraphicFramePr>
               <a:graphicFrameLocks xmlns:a="http://schemas.openxmlformats.org/drawingml/2006/main" noChangeAspect="1"/>
             </wp:cNvGraphicFramePr>
@@ -1077,7 +998,7 @@
               <a:graphicData uri="http://schemas.openxmlformats.org/drawingml/2006/picture">
                 <pic:pic xmlns:pic="http://schemas.openxmlformats.org/drawingml/2006/picture">
                   <pic:nvPicPr>
-                    <pic:cNvPr id="0" name="Picture 13"/>
+                    <pic:cNvPr id="0" name="Picture 11"/>
                     <pic:cNvPicPr>
                       <a:picLocks noChangeAspect="1" noChangeArrowheads="1"/>
                     </pic:cNvPicPr>
@@ -1144,26 +1065,26 @@
           <w:szCs w:val="24"/>
         </w:rPr>
       </w:pPr>
-      <w:r>
-        <w:rPr>
-          <w:b/>
-          <w:bCs/>
-          <w:sz w:val="24"/>
-          <w:szCs w:val="24"/>
-        </w:rPr>
-        <w:t xml:space="preserve">8 Updated </w:t>
-      </w:r>
-      <w:proofErr w:type="spellStart"/>
-      <w:r>
-        <w:rPr>
-          <w:b/>
-          <w:bCs/>
-          <w:sz w:val="24"/>
-          <w:szCs w:val="24"/>
-        </w:rPr>
-        <w:t>Sucessfully</w:t>
-      </w:r>
-      <w:proofErr w:type="spellEnd"/>
+    </w:p>
+    <w:p>
+      <w:pPr>
+        <w:rPr>
+          <w:b/>
+          <w:bCs/>
+          <w:sz w:val="24"/>
+          <w:szCs w:val="24"/>
+        </w:rPr>
+      </w:pPr>
+      <w:r>
+        <w:rPr>
+          <w:b/>
+          <w:bCs/>
+          <w:sz w:val="24"/>
+          <w:szCs w:val="24"/>
+        </w:rPr>
+        <w:lastRenderedPageBreak/>
+        <w:t>7 Update Student</w:t>
+      </w:r>
       <w:r>
         <w:rPr>
           <w:b/>
@@ -1188,10 +1109,10 @@
           <w:noProof/>
         </w:rPr>
         <w:drawing>
-          <wp:inline distT="0" distB="0" distL="0" distR="0" wp14:anchorId="244C48BF" wp14:editId="06A8C65D">
+          <wp:inline distT="0" distB="0" distL="0" distR="0" wp14:anchorId="730C7102" wp14:editId="13CE8174">
             <wp:extent cx="5731510" cy="3402965"/>
             <wp:effectExtent l="0" t="0" r="2540" b="6985"/>
-            <wp:docPr id="1957330083" name="Picture 8"/>
+            <wp:docPr id="734355034" name="Picture 7"/>
             <wp:cNvGraphicFramePr>
               <a:graphicFrameLocks xmlns:a="http://schemas.openxmlformats.org/drawingml/2006/main" noChangeAspect="1"/>
             </wp:cNvGraphicFramePr>
@@ -1199,7 +1120,7 @@
               <a:graphicData uri="http://schemas.openxmlformats.org/drawingml/2006/picture">
                 <pic:pic xmlns:pic="http://schemas.openxmlformats.org/drawingml/2006/picture">
                   <pic:nvPicPr>
-                    <pic:cNvPr id="0" name="Picture 15"/>
+                    <pic:cNvPr id="0" name="Picture 13"/>
                     <pic:cNvPicPr>
                       <a:picLocks noChangeAspect="1" noChangeArrowheads="1"/>
                     </pic:cNvPicPr>
@@ -1273,6 +1194,128 @@
           <w:sz w:val="24"/>
           <w:szCs w:val="24"/>
         </w:rPr>
+        <w:t xml:space="preserve">8 Updated </w:t>
+      </w:r>
+      <w:proofErr w:type="spellStart"/>
+      <w:r>
+        <w:rPr>
+          <w:b/>
+          <w:bCs/>
+          <w:sz w:val="24"/>
+          <w:szCs w:val="24"/>
+        </w:rPr>
+        <w:t>Sucessfully</w:t>
+      </w:r>
+      <w:proofErr w:type="spellEnd"/>
+      <w:r>
+        <w:rPr>
+          <w:b/>
+          <w:bCs/>
+          <w:sz w:val="24"/>
+          <w:szCs w:val="24"/>
+        </w:rPr>
+        <w:t>:</w:t>
+      </w:r>
+    </w:p>
+    <w:p>
+      <w:pPr>
+        <w:rPr>
+          <w:b/>
+          <w:bCs/>
+          <w:sz w:val="24"/>
+          <w:szCs w:val="24"/>
+        </w:rPr>
+      </w:pPr>
+      <w:r>
+        <w:rPr>
+          <w:noProof/>
+        </w:rPr>
+        <w:drawing>
+          <wp:inline distT="0" distB="0" distL="0" distR="0" wp14:anchorId="244C48BF" wp14:editId="06A8C65D">
+            <wp:extent cx="5731510" cy="3402965"/>
+            <wp:effectExtent l="0" t="0" r="2540" b="6985"/>
+            <wp:docPr id="1957330083" name="Picture 8"/>
+            <wp:cNvGraphicFramePr>
+              <a:graphicFrameLocks xmlns:a="http://schemas.openxmlformats.org/drawingml/2006/main" noChangeAspect="1"/>
+            </wp:cNvGraphicFramePr>
+            <a:graphic xmlns:a="http://schemas.openxmlformats.org/drawingml/2006/main">
+              <a:graphicData uri="http://schemas.openxmlformats.org/drawingml/2006/picture">
+                <pic:pic xmlns:pic="http://schemas.openxmlformats.org/drawingml/2006/picture">
+                  <pic:nvPicPr>
+                    <pic:cNvPr id="0" name="Picture 15"/>
+                    <pic:cNvPicPr>
+                      <a:picLocks noChangeAspect="1" noChangeArrowheads="1"/>
+                    </pic:cNvPicPr>
+                  </pic:nvPicPr>
+                  <pic:blipFill>
+                    <a:blip r:embed="rId12" cstate="print">
+                      <a:extLst>
+                        <a:ext uri="{28A0092B-C50C-407E-A947-70E740481C1C}">
+                          <a14:useLocalDpi xmlns:a14="http://schemas.microsoft.com/office/drawing/2010/main" val="0"/>
+                        </a:ext>
+                      </a:extLst>
+                    </a:blip>
+                    <a:srcRect/>
+                    <a:stretch>
+                      <a:fillRect/>
+                    </a:stretch>
+                  </pic:blipFill>
+                  <pic:spPr bwMode="auto">
+                    <a:xfrm>
+                      <a:off x="0" y="0"/>
+                      <a:ext cx="5731510" cy="3402965"/>
+                    </a:xfrm>
+                    <a:prstGeom prst="rect">
+                      <a:avLst/>
+                    </a:prstGeom>
+                    <a:noFill/>
+                    <a:ln>
+                      <a:noFill/>
+                    </a:ln>
+                  </pic:spPr>
+                </pic:pic>
+              </a:graphicData>
+            </a:graphic>
+          </wp:inline>
+        </w:drawing>
+      </w:r>
+    </w:p>
+    <w:p>
+      <w:pPr>
+        <w:rPr>
+          <w:b/>
+          <w:bCs/>
+          <w:sz w:val="24"/>
+          <w:szCs w:val="24"/>
+        </w:rPr>
+      </w:pPr>
+    </w:p>
+    <w:p>
+      <w:pPr>
+        <w:rPr>
+          <w:b/>
+          <w:bCs/>
+          <w:sz w:val="24"/>
+          <w:szCs w:val="24"/>
+        </w:rPr>
+      </w:pPr>
+    </w:p>
+    <w:p>
+      <w:pPr>
+        <w:rPr>
+          <w:b/>
+          <w:bCs/>
+          <w:sz w:val="24"/>
+          <w:szCs w:val="24"/>
+        </w:rPr>
+      </w:pPr>
+      <w:r>
+        <w:rPr>
+          <w:b/>
+          <w:bCs/>
+          <w:sz w:val="24"/>
+          <w:szCs w:val="24"/>
+        </w:rPr>
         <w:lastRenderedPageBreak/>
         <w:t>9 Delete One Student</w:t>
       </w:r>
@@ -1317,7 +1360,7 @@
                     </pic:cNvPicPr>
                   </pic:nvPicPr>
                   <pic:blipFill>
-                    <a:blip r:embed="rId12" cstate="print">
+                    <a:blip r:embed="rId13" cstate="print">
                       <a:extLst>
                         <a:ext uri="{28A0092B-C50C-407E-A947-70E740481C1C}">
                           <a14:useLocalDpi xmlns:a14="http://schemas.microsoft.com/office/drawing/2010/main" val="0"/>
@@ -2285,6 +2328,59 @@
       <w:spacing w:val="5"/>
     </w:rPr>
   </w:style>
+  <w:style w:type="paragraph" w:styleId="HTMLPreformatted">
+    <w:name w:val="HTML Preformatted"/>
+    <w:basedOn w:val="Normal"/>
+    <w:link w:val="HTMLPreformattedChar"/>
+    <w:uiPriority w:val="99"/>
+    <w:semiHidden/>
+    <w:unhideWhenUsed/>
+    <w:rsid w:val="00CB6507"/>
+    <w:pPr>
+      <w:spacing w:after="0" w:line="240" w:lineRule="auto"/>
+    </w:pPr>
+    <w:rPr>
+      <w:rFonts w:ascii="Consolas" w:hAnsi="Consolas"/>
+      <w:sz w:val="20"/>
+      <w:szCs w:val="20"/>
+    </w:rPr>
+  </w:style>
+  <w:style w:type="character" w:customStyle="1" w:styleId="HTMLPreformattedChar">
+    <w:name w:val="HTML Preformatted Char"/>
+    <w:basedOn w:val="DefaultParagraphFont"/>
+    <w:link w:val="HTMLPreformatted"/>
+    <w:uiPriority w:val="99"/>
+    <w:semiHidden/>
+    <w:rsid w:val="00CB6507"/>
+    <w:rPr>
+      <w:rFonts w:ascii="Consolas" w:hAnsi="Consolas"/>
+      <w:sz w:val="20"/>
+      <w:szCs w:val="20"/>
+    </w:rPr>
+  </w:style>
+  <w:style w:type="character" w:styleId="Hyperlink">
+    <w:name w:val="Hyperlink"/>
+    <w:basedOn w:val="DefaultParagraphFont"/>
+    <w:uiPriority w:val="99"/>
+    <w:unhideWhenUsed/>
+    <w:rsid w:val="00D43B10"/>
+    <w:rPr>
+      <w:color w:val="0563C1" w:themeColor="hyperlink"/>
+      <w:u w:val="single"/>
+    </w:rPr>
+  </w:style>
+  <w:style w:type="character" w:styleId="UnresolvedMention">
+    <w:name w:val="Unresolved Mention"/>
+    <w:basedOn w:val="DefaultParagraphFont"/>
+    <w:uiPriority w:val="99"/>
+    <w:semiHidden/>
+    <w:unhideWhenUsed/>
+    <w:rsid w:val="00D43B10"/>
+    <w:rPr>
+      <w:color w:val="605E5C"/>
+      <w:shd w:val="clear" w:color="auto" w:fill="E1DFDD"/>
+    </w:rPr>
+  </w:style>
 </w:styles>
 </file>
 

</xml_diff>